<commit_message>
video: 1080p full-frame re-record (3:03, burned-in subs, team card); official docx/pptx + deck screenshots and stats refreshed
</commit_message>
<xml_diff>
--- a/submission/official/C-[TeamName]-DemoVideoGuide.docx
+++ b/submission/official/C-[TeamName]-DemoVideoGuide.docx
@@ -196,7 +196,7 @@
         <w:t>C-[TeamName]-DemoVideo.mp4</w:t>
       </w:r>
       <w:r>
-        <w:t>), 3 min 26 s. Link: https://github.com/Zul-Qarnain/setu-fintechathon/blob/main/submission/Setu_Demo.mp4</w:t>
+        <w:t>), 3 min 03 s, 1920×1080. Link: https://github.com/Zul-Qarnain/setu-fintechathon/blob/main/submission/Setu_Demo.mp4</w:t>
       </w:r>
     </w:p>
     <w:p>
@@ -205,7 +205,7 @@
         <w:ind w:left="317"/>
       </w:pPr>
       <w:r>
-        <w:t>0:00–0:16 — opening: "This is Setu, a bridge for international students paying fees abroad. Everything in this video is the real application, recorded live, using synthetic data and a sandbox bank."</w:t>
+        <w:t>0:00–0:12 — opening: "This is Setu, a bridge for international students paying fees abroad. Everything in this video is the real application, recorded live, using synthetic data and a sandbox bank."</w:t>
       </w:r>
     </w:p>
     <w:p>
@@ -214,7 +214,7 @@
         <w:ind w:left="317"/>
       </w:pPr>
       <w:r>
-        <w:t>Team introduction: [TEAM NAME] and members — [TEAM MEMBERS] (to be added; the current cut opens directly with the project).</w:t>
+        <w:t>Team introduction: [TEAM NAME] and members — [TEAM MEMBERS] — shown on a team-intro card at 0:12–0:16 (team name placeholder to be filled in).</w:t>
       </w:r>
     </w:p>
     <w:p>
@@ -370,7 +370,7 @@
               <w:rPr>
                 <w:sz w:val="15"/>
               </w:rPr>
-              <w:t>0:29</w:t>
+              <w:t>0:27</w:t>
             </w:r>
           </w:p>
         </w:tc>
@@ -420,7 +420,7 @@
               <w:rPr>
                 <w:sz w:val="15"/>
               </w:rPr>
-              <w:t>0:44</w:t>
+              <w:t>0:40</w:t>
             </w:r>
           </w:p>
         </w:tc>
@@ -470,7 +470,7 @@
               <w:rPr>
                 <w:sz w:val="15"/>
               </w:rPr>
-              <w:t>1:02</w:t>
+              <w:t>0:56</w:t>
             </w:r>
           </w:p>
         </w:tc>
@@ -520,7 +520,7 @@
               <w:rPr>
                 <w:sz w:val="15"/>
               </w:rPr>
-              <w:t>1:14</w:t>
+              <w:t>1:07</w:t>
             </w:r>
           </w:p>
         </w:tc>
@@ -570,7 +570,7 @@
               <w:rPr>
                 <w:sz w:val="15"/>
               </w:rPr>
-              <w:t>1:28</w:t>
+              <w:t>1:19</w:t>
             </w:r>
           </w:p>
         </w:tc>
@@ -620,7 +620,7 @@
               <w:rPr>
                 <w:sz w:val="15"/>
               </w:rPr>
-              <w:t>1:44</w:t>
+              <w:t>1:33</w:t>
             </w:r>
           </w:p>
         </w:tc>
@@ -670,7 +670,7 @@
               <w:rPr>
                 <w:sz w:val="15"/>
               </w:rPr>
-              <w:t>2:02</w:t>
+              <w:t>1:49</w:t>
             </w:r>
           </w:p>
         </w:tc>
@@ -720,7 +720,7 @@
               <w:rPr>
                 <w:sz w:val="15"/>
               </w:rPr>
-              <w:t>2:18</w:t>
+              <w:t>2:03</w:t>
             </w:r>
           </w:p>
         </w:tc>
@@ -770,7 +770,7 @@
               <w:rPr>
                 <w:sz w:val="15"/>
               </w:rPr>
-              <w:t>2:32</w:t>
+              <w:t>2:15</w:t>
             </w:r>
           </w:p>
         </w:tc>
@@ -820,7 +820,7 @@
               <w:rPr>
                 <w:sz w:val="15"/>
               </w:rPr>
-              <w:t>2:42</w:t>
+              <w:t>2:24</w:t>
             </w:r>
           </w:p>
         </w:tc>
@@ -879,7 +879,7 @@
         <w:ind w:left="317"/>
       </w:pPr>
       <w:r>
-        <w:t xml:space="preserve">2:55 — </w:t>
+        <w:t xml:space="preserve">2:34 — </w:t>
       </w:r>
       <w:r>
         <w:rPr>
@@ -897,7 +897,7 @@
         <w:ind w:left="317"/>
       </w:pPr>
       <w:r>
-        <w:t>3:12 — "Setu. A scripted planner interprets the request, deterministic code computes the numbers, a policy engine decides, and people approve. Thank you for watching."</w:t>
+        <w:t>2:50 — "Setu. A scripted planner interprets the request, deterministic code computes the numbers, a policy engine decides, and people approve. Thank you for watching."</w:t>
       </w:r>
     </w:p>
     <w:p>
@@ -932,7 +932,7 @@
         <w:ind w:left="317"/>
       </w:pPr>
       <w:r>
-        <w:t>16:9 landscape, 1280×720 (720p), 25 fps, H.264 + AAC. Recorded headless from the real UI with Playwright (</w:t>
+        <w:t>16:9 landscape, 1920×1080 (1080p), 30 fps, H.264 + AAC. Recorded headless from the real UI with Playwright (</w:t>
       </w:r>
       <w:r>
         <w:rPr>
@@ -960,7 +960,7 @@
         <w:ind w:left="317"/>
       </w:pPr>
       <w:r>
-        <w:t>Interface recorded at 1280×720; English narration (synthesised piper TTS voice-over) on every scene; on-screen captions on 12 of the 14 narration segments (English; the Chinese-UI scene is captioned in 简体中文 and English). The narration is not provided as a separate full English subtitle track.</w:t>
+        <w:t>Interface recorded at 1440×810 and scaled to 1920×1080; English narration (synthesised ElevenLabs voice-over) on every scene, with full English subtitles for all narration burned into the video; on-screen captions on 12 of the 14 narration segments (English; the Chinese-UI scene is captioned in 简体中文 and English). Subtitles are generated from the narration script (submission/record/out/subs.srt).</w:t>
       </w:r>
     </w:p>
     <w:p>
@@ -1014,7 +1014,7 @@
         <w:t>C-[TeamName]-DemoVideo.mp4</w:t>
       </w:r>
       <w:r>
-        <w:t>. Duration 3 min 26 s (limit 5 minutes).</w:t>
+        <w:t>. Duration 3 min 03 s (limit 5 minutes).</w:t>
       </w:r>
     </w:p>
     <w:sectPr>

</xml_diff>